<commit_message>
Update to Resume Mode
Resume Mode in index.html is not dynamically reading the DOCX, it’s just hardcoded HTML inside the resume panel. So I’m replacing that panel content from the new DOCX and repointing the download button to the updated file.
</commit_message>
<xml_diff>
--- a/Shaker_Zaman_Resume3_5_26_updated.docx
+++ b/Shaker_Zaman_Resume3_5_26_updated.docx
@@ -382,7 +382,7 @@
           <w:sz w:val="18"/>
           <w:shd w:fill="auto" w:val="clear"/>
         </w:rPr>
-        <w:t xml:space="preserve">Drove SOC 2 Type I completion end-to-end via Vanta, including policy authoring, MDM configuration (NanoMDM), device offboarding checklists, and evidence collection using AI-assisted compliance drafting.</w:t>
+        <w:t xml:space="preserve">Core operator at a fast-moving AI infrastructure startup (Khosla-backed, $5.75M seed). Owned 10+ functional areas in a high-tempo environment with tight deadlines and constant priority shifts, using AI-agent-augmented workflows to pivot on the spot and operate at the speed of a cross-functional team.</w:t>
       </w:r>
     </w:p>
     <w:p>
@@ -412,7 +412,7 @@
           <w:sz w:val="18"/>
           <w:shd w:fill="auto" w:val="clear"/>
         </w:rPr>
-        <w:t xml:space="preserve">Contributed copy for all product marketing across Infinibranch platform launches (Liquid Metal, Browsers) spanning Twitter, LinkedIn, email, and Slack.</w:t>
+        <w:t xml:space="preserve">Drove SOC 2 Type I completion end-to-end via Vanta, including policy authoring, MDM configuration (NanoMDM), device offboarding checklists, and evidence collection using AI-assisted compliance drafting.</w:t>
       </w:r>
     </w:p>
     <w:p>
@@ -442,7 +442,7 @@
           <w:sz w:val="18"/>
           <w:shd w:fill="auto" w:val="clear"/>
         </w:rPr>
-        <w:t xml:space="preserve">Built and executed influencer pricing playbook with CPM-based framework, CAC ceiling modeling ($50/signup), and brand-safety criteria for CLI coding-agent creator partnerships.</w:t>
+        <w:t xml:space="preserve">Contributed copy for all product marketing across Infinibranch platform launches (Liquid Metal, Browsers) spanning Twitter, LinkedIn, email, and Slack.</w:t>
       </w:r>
     </w:p>
     <w:p>
@@ -472,7 +472,7 @@
           <w:sz w:val="18"/>
           <w:shd w:fill="auto" w:val="clear"/>
         </w:rPr>
-        <w:t xml:space="preserve">Designed a customizable recruiting pipeline with configurable targeting parameters (degree type, GitHub activity heuristics, commit frequency, OSS contribution depth) and AI-driven candidate discovery and outreach personalization.</w:t>
+        <w:t xml:space="preserve">Built and executed influencer pricing playbook with CPM-based framework, CAC ceiling modeling ($50/signup), and brand-safety criteria for CLI coding-agent creator partnerships.</w:t>
       </w:r>
     </w:p>
     <w:p>
@@ -502,7 +502,7 @@
           <w:sz w:val="18"/>
           <w:shd w:fill="auto" w:val="clear"/>
         </w:rPr>
-        <w:t xml:space="preserve">Managed Stripe billing infrastructure, SendGrid email campaigns, and built fraud detection systems for the platform's internal credit system.</w:t>
+        <w:t xml:space="preserve">Designed a customizable recruiting pipeline with configurable targeting parameters (degree type, GitHub activity heuristics, commit frequency, OSS contribution depth) and AI-driven candidate discovery and outreach personalization.</w:t>
       </w:r>
     </w:p>
     <w:p>
@@ -532,7 +532,7 @@
           <w:sz w:val="18"/>
           <w:shd w:fill="auto" w:val="clear"/>
         </w:rPr>
-        <w:t xml:space="preserve">Conducted YC company research and built targeted outbound email campaigns for enterprise GTM motion.</w:t>
+        <w:t xml:space="preserve">Managed Stripe billing infrastructure, SendGrid email campaigns, and built fraud detection systems for the platform's internal credit system.</w:t>
       </w:r>
     </w:p>
     <w:p>
@@ -562,6 +562,36 @@
           <w:sz w:val="18"/>
           <w:shd w:fill="auto" w:val="clear"/>
         </w:rPr>
+        <w:t xml:space="preserve">Conducted YC company research and built targeted outbound email campaigns for enterprise GTM motion.</w:t>
+      </w:r>
+    </w:p>
+    <w:p>
+      <w:pPr>
+        <w:numPr>
+          <w:ilvl w:val="0"/>
+          <w:numId w:val="10"/>
+        </w:numPr>
+        <w:spacing w:before="15" w:after="15" w:line="240"/>
+        <w:ind w:right="0" w:left="450" w:hanging="220"/>
+        <w:jc w:val="left"/>
+        <w:rPr>
+          <w:rFonts w:ascii="Arial" w:hAnsi="Arial" w:cs="Arial" w:eastAsia="Arial"/>
+          <w:color w:val="333333"/>
+          <w:spacing w:val="0"/>
+          <w:position w:val="0"/>
+          <w:sz w:val="18"/>
+          <w:shd w:fill="auto" w:val="clear"/>
+        </w:rPr>
+      </w:pPr>
+      <w:r>
+        <w:rPr>
+          <w:rFonts w:ascii="Arial" w:hAnsi="Arial" w:cs="Arial" w:eastAsia="Arial"/>
+          <w:color w:val="333333"/>
+          <w:spacing w:val="0"/>
+          <w:position w:val="0"/>
+          <w:sz w:val="18"/>
+          <w:shd w:fill="auto" w:val="clear"/>
+        </w:rPr>
         <w:t xml:space="preserve">Assisted in preparing a DARPA Seedling cost proposal (expMath program), contributing to budget modeling, narrative drafting, and compliance formatting</w:t>
       </w:r>
       <w:r>
@@ -1278,10 +1308,10 @@
         <w:jc w:val="left"/>
         <w:rPr>
           <w:rFonts w:ascii="Arial" w:hAnsi="Arial" w:cs="Arial" w:eastAsia="Arial"/>
-          <w:color w:val="333333"/>
-          <w:spacing w:val="0"/>
-          <w:position w:val="0"/>
-          <w:sz w:val="18"/>
+          <w:color w:val="555555"/>
+          <w:spacing w:val="0"/>
+          <w:position w:val="0"/>
+          <w:sz w:val="17"/>
           <w:shd w:fill="auto" w:val="clear"/>
         </w:rPr>
       </w:pPr>
@@ -1375,7 +1405,7 @@
           <w:sz w:val="17"/>
           <w:shd w:fill="auto" w:val="clear"/>
         </w:rPr>
-        <w:t xml:space="preserve">Influencer partnerships, email campaigns, product positioning, developer advocacy</w:t>
+        <w:t xml:space="preserve">Influencer partnerships, email campaigns, product positioning</w:t>
       </w:r>
     </w:p>
   </w:body>

</xml_diff>